<commit_message>
Update Driving License Management SRS_1.0.docx
</commit_message>
<xml_diff>
--- a/docs/Driving License Management SRS_1.0.docx
+++ b/docs/Driving License Management SRS_1.0.docx
@@ -670,6 +670,7 @@
               </w:rPr>
               <w:t>Web Application (</w:t>
             </w:r>
+            <w:proofErr w:type="spellStart"/>
             <w:r>
               <w:rPr>
                 <w:sz w:val="20"/>
@@ -677,6 +678,7 @@
               </w:rPr>
               <w:t>Blazor</w:t>
             </w:r>
+            <w:proofErr w:type="spellEnd"/>
             <w:r>
               <w:rPr>
                 <w:sz w:val="20"/>
@@ -1850,19 +1852,204 @@
     </w:p>
     <w:p/>
     <w:p>
-      <w:r>
-        <w:t>1.1 Purpose</w:t>
+      <w:pPr>
+        <w:pStyle w:val="ListParagraph"/>
+        <w:numPr>
+          <w:ilvl w:val="1"/>
+          <w:numId w:val="1"/>
+        </w:numPr>
+      </w:pPr>
+      <w:r>
+        <w:t xml:space="preserve">Introduction </w:t>
       </w:r>
     </w:p>
-    <w:p/>
-    <w:p/>
     <w:p>
-      <w:r>
-        <w:t>1.2 Scope</w:t>
+      <w:pPr>
+        <w:ind w:firstLine="390"/>
+        <w:rPr>
+          <w:sz w:val="22"/>
+          <w:szCs w:val="22"/>
+          <w:lang w:bidi="ar-JO"/>
+        </w:rPr>
+      </w:pPr>
+      <w:r>
+        <w:rPr>
+          <w:sz w:val="22"/>
+          <w:szCs w:val="22"/>
+          <w:lang w:bidi="ar-JO"/>
+        </w:rPr>
+        <w:t xml:space="preserve">The </w:t>
+      </w:r>
+      <w:r>
+        <w:rPr>
+          <w:sz w:val="22"/>
+          <w:szCs w:val="22"/>
+          <w:lang w:bidi="ar-JO"/>
+        </w:rPr>
+        <w:t xml:space="preserve">Driving &amp; Vehicle </w:t>
+      </w:r>
+      <w:proofErr w:type="gramStart"/>
+      <w:r>
+        <w:rPr>
+          <w:sz w:val="22"/>
+          <w:szCs w:val="22"/>
+          <w:lang w:bidi="ar-JO"/>
+        </w:rPr>
+        <w:t>License  Department</w:t>
+      </w:r>
+      <w:proofErr w:type="gramEnd"/>
+      <w:r>
+        <w:rPr>
+          <w:sz w:val="22"/>
+          <w:szCs w:val="22"/>
+          <w:lang w:bidi="ar-JO"/>
+        </w:rPr>
+        <w:t xml:space="preserve"> (DVLD) System is a desktop application developed using C# to manage driver license services. The system helps organize the process of issuing, renewing, replacing, detaining, and releasing driving licenses.</w:t>
       </w:r>
     </w:p>
-    <w:p/>
-    <w:p/>
+    <w:p>
+      <w:pPr>
+        <w:ind w:firstLine="390"/>
+        <w:rPr>
+          <w:sz w:val="22"/>
+          <w:szCs w:val="22"/>
+          <w:rtl/>
+          <w:lang w:bidi="ar-JO"/>
+        </w:rPr>
+      </w:pPr>
+      <w:r>
+        <w:rPr>
+          <w:sz w:val="22"/>
+          <w:szCs w:val="22"/>
+          <w:lang w:bidi="ar-JO"/>
+        </w:rPr>
+        <w:t>The main goal of the system is to reduce manual, work improve data accuracy, and ensure that driving licenses are issued only to qualified applications who meet the required conditions and pass the required tests.</w:t>
+      </w:r>
+    </w:p>
+    <w:p>
+      <w:pPr>
+        <w:pStyle w:val="ListParagraph"/>
+        <w:numPr>
+          <w:ilvl w:val="1"/>
+          <w:numId w:val="1"/>
+        </w:numPr>
+      </w:pPr>
+      <w:r>
+        <w:t>Purpose</w:t>
+      </w:r>
+    </w:p>
+    <w:p>
+      <w:pPr>
+        <w:ind w:firstLine="390"/>
+        <w:rPr>
+          <w:sz w:val="20"/>
+          <w:szCs w:val="20"/>
+        </w:rPr>
+      </w:pPr>
+      <w:r>
+        <w:rPr>
+          <w:sz w:val="20"/>
+          <w:szCs w:val="20"/>
+        </w:rPr>
+        <w:t>This</w:t>
+      </w:r>
+      <w:r>
+        <w:rPr>
+          <w:sz w:val="20"/>
+          <w:szCs w:val="20"/>
+        </w:rPr>
+        <w:t xml:space="preserve"> Software Requirements Specification (SRS) document formally describes the functional and non-functional requirements for the </w:t>
+      </w:r>
+      <w:r>
+        <w:rPr>
+          <w:sz w:val="20"/>
+          <w:szCs w:val="20"/>
+        </w:rPr>
+        <w:t>DVLD</w:t>
+      </w:r>
+      <w:r>
+        <w:rPr>
+          <w:sz w:val="20"/>
+          <w:szCs w:val="20"/>
+        </w:rPr>
+        <w:t xml:space="preserve"> </w:t>
+      </w:r>
+      <w:r>
+        <w:rPr>
+          <w:sz w:val="20"/>
+          <w:szCs w:val="20"/>
+        </w:rPr>
+        <w:t>System</w:t>
+      </w:r>
+      <w:r>
+        <w:rPr>
+          <w:sz w:val="20"/>
+          <w:szCs w:val="20"/>
+        </w:rPr>
+        <w:t>.</w:t>
+      </w:r>
+    </w:p>
+    <w:p>
+      <w:pPr>
+        <w:ind w:firstLine="390"/>
+        <w:rPr>
+          <w:sz w:val="20"/>
+          <w:szCs w:val="20"/>
+        </w:rPr>
+      </w:pPr>
+      <w:r>
+        <w:rPr>
+          <w:sz w:val="20"/>
+          <w:szCs w:val="20"/>
+        </w:rPr>
+        <w:t>This document defines what the system should do, the users who will interact with it, thew main services provided by the system, and the constraints that must be considered during development.</w:t>
+      </w:r>
+    </w:p>
+    <w:p>
+      <w:r>
+        <w:t>1.</w:t>
+      </w:r>
+      <w:r>
+        <w:t>3</w:t>
+      </w:r>
+      <w:r>
+        <w:t xml:space="preserve"> Scope</w:t>
+      </w:r>
+    </w:p>
+    <w:p>
+      <w:pPr>
+        <w:rPr>
+          <w:sz w:val="22"/>
+          <w:szCs w:val="22"/>
+          <w:lang w:bidi="ar-JO"/>
+        </w:rPr>
+      </w:pPr>
+      <w:r>
+        <w:rPr>
+          <w:sz w:val="22"/>
+          <w:szCs w:val="22"/>
+          <w:lang w:bidi="ar-JO"/>
+        </w:rPr>
+        <w:t>The system is intended for use by DVLD employees and administrators to improve accuracy, reduce manual work, and ensure proper management of driver licensing procedures</w:t>
+      </w:r>
+    </w:p>
+    <w:p>
+      <w:pPr>
+        <w:rPr>
+          <w:sz w:val="22"/>
+          <w:szCs w:val="22"/>
+          <w:lang w:bidi="ar-JO"/>
+        </w:rPr>
+      </w:pPr>
+    </w:p>
+    <w:p>
+      <w:pPr>
+        <w:rPr>
+          <w:sz w:val="22"/>
+          <w:szCs w:val="22"/>
+        </w:rPr>
+      </w:pPr>
+    </w:p>
     <w:p>
       <w:r>
         <w:t>1.3 Definitions &amp; Acronyms</w:t>
@@ -2067,6 +2254,1057 @@
     </w:tbl>
     <w:p/>
     <w:p/>
+    <w:p/>
+    <w:p/>
+    <w:p>
+      <w:r>
+        <w:rPr>
+          <w:noProof/>
+        </w:rPr>
+        <w:lastRenderedPageBreak/>
+        <mc:AlternateContent>
+          <mc:Choice Requires="wps">
+            <w:drawing>
+              <wp:anchor distT="0" distB="0" distL="114300" distR="114300" simplePos="0" relativeHeight="251666432" behindDoc="0" locked="0" layoutInCell="1" allowOverlap="1" wp14:anchorId="5A7EBDEF" wp14:editId="4B495097">
+                <wp:simplePos x="0" y="0"/>
+                <wp:positionH relativeFrom="margin">
+                  <wp:posOffset>0</wp:posOffset>
+                </wp:positionH>
+                <wp:positionV relativeFrom="paragraph">
+                  <wp:posOffset>38100</wp:posOffset>
+                </wp:positionV>
+                <wp:extent cx="5424805" cy="382137"/>
+                <wp:effectExtent l="76200" t="38100" r="80645" b="208915"/>
+                <wp:wrapNone/>
+                <wp:docPr id="5" name="Rectangle 5"/>
+                <wp:cNvGraphicFramePr/>
+                <a:graphic xmlns:a="http://schemas.openxmlformats.org/drawingml/2006/main">
+                  <a:graphicData uri="http://schemas.microsoft.com/office/word/2010/wordprocessingShape">
+                    <wps:wsp>
+                      <wps:cNvSpPr/>
+                      <wps:spPr>
+                        <a:xfrm>
+                          <a:off x="0" y="0"/>
+                          <a:ext cx="5424805" cy="382137"/>
+                        </a:xfrm>
+                        <a:prstGeom prst="rect">
+                          <a:avLst/>
+                        </a:prstGeom>
+                        <a:effectLst>
+                          <a:outerShdw blurRad="57150" dist="19050" dir="5400000" algn="ctr" rotWithShape="0">
+                            <a:srgbClr val="000000">
+                              <a:alpha val="63000"/>
+                            </a:srgbClr>
+                          </a:outerShdw>
+                          <a:reflection blurRad="6350" stA="50000" endA="300" endPos="38500" dist="50800" dir="5400000" sy="-100000" algn="bl" rotWithShape="0"/>
+                        </a:effectLst>
+                      </wps:spPr>
+                      <wps:style>
+                        <a:lnRef idx="0">
+                          <a:schemeClr val="accent1"/>
+                        </a:lnRef>
+                        <a:fillRef idx="3">
+                          <a:schemeClr val="accent1"/>
+                        </a:fillRef>
+                        <a:effectRef idx="3">
+                          <a:schemeClr val="accent1"/>
+                        </a:effectRef>
+                        <a:fontRef idx="minor">
+                          <a:schemeClr val="lt1"/>
+                        </a:fontRef>
+                      </wps:style>
+                      <wps:txbx>
+                        <w:txbxContent>
+                          <w:p>
+                            <w:pPr>
+                              <w:rPr>
+                                <w:sz w:val="32"/>
+                                <w:szCs w:val="32"/>
+                              </w:rPr>
+                            </w:pPr>
+                            <w:r>
+                              <w:rPr>
+                                <w:sz w:val="32"/>
+                                <w:szCs w:val="32"/>
+                              </w:rPr>
+                              <w:t>2</w:t>
+                            </w:r>
+                            <w:r>
+                              <w:rPr>
+                                <w:sz w:val="32"/>
+                                <w:szCs w:val="32"/>
+                              </w:rPr>
+                              <w:t xml:space="preserve">. </w:t>
+                            </w:r>
+                            <w:r>
+                              <w:rPr>
+                                <w:sz w:val="32"/>
+                                <w:szCs w:val="32"/>
+                              </w:rPr>
+                              <w:t>Overall Description</w:t>
+                            </w:r>
+                          </w:p>
+                        </w:txbxContent>
+                      </wps:txbx>
+                      <wps:bodyPr rot="0" spcFirstLastPara="0" vertOverflow="overflow" horzOverflow="overflow" vert="horz" wrap="square" lIns="91440" tIns="45720" rIns="91440" bIns="45720" numCol="1" spcCol="0" rtlCol="0" fromWordArt="0" anchor="ctr" anchorCtr="0" forceAA="0" compatLnSpc="1">
+                        <a:prstTxWarp prst="textNoShape">
+                          <a:avLst/>
+                        </a:prstTxWarp>
+                        <a:noAutofit/>
+                      </wps:bodyPr>
+                    </wps:wsp>
+                  </a:graphicData>
+                </a:graphic>
+                <wp14:sizeRelV relativeFrom="margin">
+                  <wp14:pctHeight>0</wp14:pctHeight>
+                </wp14:sizeRelV>
+              </wp:anchor>
+            </w:drawing>
+          </mc:Choice>
+          <mc:Fallback>
+            <w:pict>
+              <v:rect w14:anchorId="5A7EBDEF" id="Rectangle 5" o:spid="_x0000_s1029" style="position:absolute;margin-left:0;margin-top:3pt;width:427.15pt;height:30.1pt;z-index:251666432;visibility:visible;mso-wrap-style:square;mso-height-percent:0;mso-wrap-distance-left:9pt;mso-wrap-distance-top:0;mso-wrap-distance-right:9pt;mso-wrap-distance-bottom:0;mso-position-horizontal:absolute;mso-position-horizontal-relative:margin;mso-position-vertical:absolute;mso-position-vertical-relative:text;mso-height-percent:0;mso-height-relative:margin;v-text-anchor:middle" o:gfxdata="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" fillcolor="#186d95 [3028]" stroked="f">
+                <v:fill color2="#145e80 [3172]" rotate="t" colors="0 #497491;.5 #106287;1 #08587c" focus="100%" type="gradient">
+                  <o:fill v:ext="view" type="gradientUnscaled"/>
+                </v:fill>
+                <v:shadow on="t" color="black" opacity="41287f" offset="0,1.5pt"/>
+                <v:textbox>
+                  <w:txbxContent>
+                    <w:p>
+                      <w:pPr>
+                        <w:rPr>
+                          <w:sz w:val="32"/>
+                          <w:szCs w:val="32"/>
+                        </w:rPr>
+                      </w:pPr>
+                      <w:r>
+                        <w:rPr>
+                          <w:sz w:val="32"/>
+                          <w:szCs w:val="32"/>
+                        </w:rPr>
+                        <w:t>2</w:t>
+                      </w:r>
+                      <w:r>
+                        <w:rPr>
+                          <w:sz w:val="32"/>
+                          <w:szCs w:val="32"/>
+                        </w:rPr>
+                        <w:t xml:space="preserve">. </w:t>
+                      </w:r>
+                      <w:r>
+                        <w:rPr>
+                          <w:sz w:val="32"/>
+                          <w:szCs w:val="32"/>
+                        </w:rPr>
+                        <w:t>Overall Description</w:t>
+                      </w:r>
+                    </w:p>
+                  </w:txbxContent>
+                </v:textbox>
+                <w10:wrap anchorx="margin"/>
+              </v:rect>
+            </w:pict>
+          </mc:Fallback>
+        </mc:AlternateContent>
+      </w:r>
+    </w:p>
+    <w:p/>
+    <w:p>
+      <w:r>
+        <w:t xml:space="preserve">2.1 product perspective </w:t>
+      </w:r>
+    </w:p>
+    <w:p>
+      <w:pPr>
+        <w:ind w:firstLine="720"/>
+        <w:rPr>
+          <w:sz w:val="22"/>
+          <w:szCs w:val="22"/>
+        </w:rPr>
+      </w:pPr>
+      <w:r>
+        <w:rPr>
+          <w:sz w:val="22"/>
+          <w:szCs w:val="22"/>
+        </w:rPr>
+        <w:t>The Driving &amp; Vehicle License Department (DVLD) System is a standalone desktop application developed using C#. The system is designed to automate and manage driver licensing services within the Driving &amp; Vehicle License Department.</w:t>
+      </w:r>
+    </w:p>
+    <w:p>
+      <w:pPr>
+        <w:ind w:firstLine="720"/>
+        <w:rPr>
+          <w:sz w:val="22"/>
+          <w:szCs w:val="22"/>
+        </w:rPr>
+      </w:pPr>
+      <w:r>
+        <w:rPr>
+          <w:sz w:val="22"/>
+          <w:szCs w:val="22"/>
+        </w:rPr>
+        <w:t>The system maintains information about persons, drivers, applications, licenses, tests, and users. It provides a centralized platform for processing license-related services, tracking applications, managing driving tests, and maintaining licensing records.</w:t>
+      </w:r>
+    </w:p>
+    <w:p>
+      <w:r>
+        <w:t>2.2 product features</w:t>
+      </w:r>
+    </w:p>
+    <w:p>
+      <w:pPr>
+        <w:rPr>
+          <w:sz w:val="22"/>
+          <w:szCs w:val="22"/>
+          <w:rtl/>
+        </w:rPr>
+      </w:pPr>
+      <w:r>
+        <w:rPr>
+          <w:sz w:val="22"/>
+          <w:szCs w:val="22"/>
+        </w:rPr>
+        <w:t>The DVLD System is designed to support the following main process:</w:t>
+      </w:r>
+    </w:p>
+    <w:p>
+      <w:pPr>
+        <w:spacing w:after="0" w:line="240" w:lineRule="auto"/>
+        <w:ind w:firstLine="360"/>
+        <w:rPr>
+          <w:rFonts w:ascii="Times New Roman" w:eastAsia="Times New Roman" w:hAnsi="Times New Roman" w:cs="Times New Roman"/>
+          <w:kern w:val="0"/>
+          <w14:ligatures w14:val="none"/>
+        </w:rPr>
+      </w:pPr>
+      <w:proofErr w:type="gramStart"/>
+      <w:r>
+        <w:rPr>
+          <w:rFonts w:ascii="Times New Roman" w:eastAsia="Times New Roman" w:hAnsi="Symbol" w:cs="Times New Roman"/>
+          <w:kern w:val="0"/>
+          <w14:ligatures w14:val="none"/>
+        </w:rPr>
+        <w:t></w:t>
+      </w:r>
+      <w:r>
+        <w:rPr>
+          <w:rFonts w:ascii="Times New Roman" w:eastAsia="Times New Roman" w:hAnsi="Times New Roman" w:cs="Times New Roman"/>
+          <w:kern w:val="0"/>
+          <w14:ligatures w14:val="none"/>
+        </w:rPr>
+        <w:t xml:space="preserve">  First</w:t>
+      </w:r>
+      <w:proofErr w:type="gramEnd"/>
+      <w:r>
+        <w:rPr>
+          <w:rFonts w:ascii="Times New Roman" w:eastAsia="Times New Roman" w:hAnsi="Times New Roman" w:cs="Times New Roman"/>
+          <w:kern w:val="0"/>
+          <w14:ligatures w14:val="none"/>
+        </w:rPr>
+        <w:t>-Time Driving License Issuance.</w:t>
+      </w:r>
+    </w:p>
+    <w:p>
+      <w:pPr>
+        <w:spacing w:after="0" w:line="240" w:lineRule="auto"/>
+        <w:ind w:firstLine="360"/>
+        <w:rPr>
+          <w:rFonts w:ascii="Times New Roman" w:eastAsia="Times New Roman" w:hAnsi="Times New Roman" w:cs="Times New Roman"/>
+          <w:kern w:val="0"/>
+          <w14:ligatures w14:val="none"/>
+        </w:rPr>
+      </w:pPr>
+      <w:proofErr w:type="gramStart"/>
+      <w:r>
+        <w:rPr>
+          <w:rFonts w:ascii="Times New Roman" w:eastAsia="Times New Roman" w:hAnsi="Symbol" w:cs="Times New Roman"/>
+          <w:kern w:val="0"/>
+          <w14:ligatures w14:val="none"/>
+        </w:rPr>
+        <w:t></w:t>
+      </w:r>
+      <w:r>
+        <w:rPr>
+          <w:rFonts w:ascii="Times New Roman" w:eastAsia="Times New Roman" w:hAnsi="Times New Roman" w:cs="Times New Roman"/>
+          <w:kern w:val="0"/>
+          <w14:ligatures w14:val="none"/>
+        </w:rPr>
+        <w:t xml:space="preserve">  Retake</w:t>
+      </w:r>
+      <w:proofErr w:type="gramEnd"/>
+      <w:r>
+        <w:rPr>
+          <w:rFonts w:ascii="Times New Roman" w:eastAsia="Times New Roman" w:hAnsi="Times New Roman" w:cs="Times New Roman"/>
+          <w:kern w:val="0"/>
+          <w14:ligatures w14:val="none"/>
+        </w:rPr>
+        <w:t xml:space="preserve"> Test Management.</w:t>
+      </w:r>
+    </w:p>
+    <w:p>
+      <w:pPr>
+        <w:spacing w:after="0" w:line="240" w:lineRule="auto"/>
+        <w:ind w:firstLine="360"/>
+        <w:rPr>
+          <w:rFonts w:ascii="Times New Roman" w:eastAsia="Times New Roman" w:hAnsi="Times New Roman" w:cs="Times New Roman"/>
+          <w:kern w:val="0"/>
+          <w14:ligatures w14:val="none"/>
+        </w:rPr>
+      </w:pPr>
+      <w:proofErr w:type="gramStart"/>
+      <w:r>
+        <w:rPr>
+          <w:rFonts w:ascii="Times New Roman" w:eastAsia="Times New Roman" w:hAnsi="Symbol" w:cs="Times New Roman"/>
+          <w:kern w:val="0"/>
+          <w14:ligatures w14:val="none"/>
+        </w:rPr>
+        <w:t></w:t>
+      </w:r>
+      <w:r>
+        <w:rPr>
+          <w:rFonts w:ascii="Times New Roman" w:eastAsia="Times New Roman" w:hAnsi="Times New Roman" w:cs="Times New Roman"/>
+          <w:kern w:val="0"/>
+          <w14:ligatures w14:val="none"/>
+        </w:rPr>
+        <w:t xml:space="preserve">  Driving</w:t>
+      </w:r>
+      <w:proofErr w:type="gramEnd"/>
+      <w:r>
+        <w:rPr>
+          <w:rFonts w:ascii="Times New Roman" w:eastAsia="Times New Roman" w:hAnsi="Times New Roman" w:cs="Times New Roman"/>
+          <w:kern w:val="0"/>
+          <w14:ligatures w14:val="none"/>
+        </w:rPr>
+        <w:t xml:space="preserve"> License Renewal.</w:t>
+      </w:r>
+    </w:p>
+    <w:p>
+      <w:pPr>
+        <w:spacing w:after="0" w:line="240" w:lineRule="auto"/>
+        <w:ind w:firstLine="360"/>
+        <w:rPr>
+          <w:rFonts w:ascii="Times New Roman" w:eastAsia="Times New Roman" w:hAnsi="Times New Roman" w:cs="Times New Roman"/>
+          <w:kern w:val="0"/>
+          <w14:ligatures w14:val="none"/>
+        </w:rPr>
+      </w:pPr>
+      <w:proofErr w:type="gramStart"/>
+      <w:r>
+        <w:rPr>
+          <w:rFonts w:ascii="Times New Roman" w:eastAsia="Times New Roman" w:hAnsi="Symbol" w:cs="Times New Roman"/>
+          <w:kern w:val="0"/>
+          <w14:ligatures w14:val="none"/>
+        </w:rPr>
+        <w:t></w:t>
+      </w:r>
+      <w:r>
+        <w:rPr>
+          <w:rFonts w:ascii="Times New Roman" w:eastAsia="Times New Roman" w:hAnsi="Times New Roman" w:cs="Times New Roman"/>
+          <w:kern w:val="0"/>
+          <w14:ligatures w14:val="none"/>
+        </w:rPr>
+        <w:t xml:space="preserve">  Lost</w:t>
+      </w:r>
+      <w:proofErr w:type="gramEnd"/>
+      <w:r>
+        <w:rPr>
+          <w:rFonts w:ascii="Times New Roman" w:eastAsia="Times New Roman" w:hAnsi="Times New Roman" w:cs="Times New Roman"/>
+          <w:kern w:val="0"/>
+          <w14:ligatures w14:val="none"/>
+        </w:rPr>
+        <w:t xml:space="preserve"> License Replacement.</w:t>
+      </w:r>
+    </w:p>
+    <w:p>
+      <w:pPr>
+        <w:spacing w:after="0" w:line="240" w:lineRule="auto"/>
+        <w:ind w:firstLine="360"/>
+        <w:rPr>
+          <w:rFonts w:ascii="Times New Roman" w:eastAsia="Times New Roman" w:hAnsi="Times New Roman" w:cs="Times New Roman"/>
+          <w:kern w:val="0"/>
+          <w14:ligatures w14:val="none"/>
+        </w:rPr>
+      </w:pPr>
+      <w:proofErr w:type="gramStart"/>
+      <w:r>
+        <w:rPr>
+          <w:rFonts w:ascii="Times New Roman" w:eastAsia="Times New Roman" w:hAnsi="Symbol" w:cs="Times New Roman"/>
+          <w:kern w:val="0"/>
+          <w14:ligatures w14:val="none"/>
+        </w:rPr>
+        <w:t></w:t>
+      </w:r>
+      <w:r>
+        <w:rPr>
+          <w:rFonts w:ascii="Times New Roman" w:eastAsia="Times New Roman" w:hAnsi="Times New Roman" w:cs="Times New Roman"/>
+          <w:kern w:val="0"/>
+          <w14:ligatures w14:val="none"/>
+        </w:rPr>
+        <w:t xml:space="preserve">  Damaged</w:t>
+      </w:r>
+      <w:proofErr w:type="gramEnd"/>
+      <w:r>
+        <w:rPr>
+          <w:rFonts w:ascii="Times New Roman" w:eastAsia="Times New Roman" w:hAnsi="Times New Roman" w:cs="Times New Roman"/>
+          <w:kern w:val="0"/>
+          <w14:ligatures w14:val="none"/>
+        </w:rPr>
+        <w:t xml:space="preserve"> License Replacement.</w:t>
+      </w:r>
+    </w:p>
+    <w:p>
+      <w:pPr>
+        <w:spacing w:after="0" w:line="240" w:lineRule="auto"/>
+        <w:ind w:firstLine="360"/>
+        <w:rPr>
+          <w:rFonts w:ascii="Times New Roman" w:eastAsia="Times New Roman" w:hAnsi="Times New Roman" w:cs="Times New Roman"/>
+          <w:kern w:val="0"/>
+          <w14:ligatures w14:val="none"/>
+        </w:rPr>
+      </w:pPr>
+      <w:proofErr w:type="gramStart"/>
+      <w:r>
+        <w:rPr>
+          <w:rFonts w:ascii="Times New Roman" w:eastAsia="Times New Roman" w:hAnsi="Symbol" w:cs="Times New Roman"/>
+          <w:kern w:val="0"/>
+          <w14:ligatures w14:val="none"/>
+        </w:rPr>
+        <w:t></w:t>
+      </w:r>
+      <w:r>
+        <w:rPr>
+          <w:rFonts w:ascii="Times New Roman" w:eastAsia="Times New Roman" w:hAnsi="Times New Roman" w:cs="Times New Roman"/>
+          <w:kern w:val="0"/>
+          <w14:ligatures w14:val="none"/>
+        </w:rPr>
+        <w:t xml:space="preserve">  Driving</w:t>
+      </w:r>
+      <w:proofErr w:type="gramEnd"/>
+      <w:r>
+        <w:rPr>
+          <w:rFonts w:ascii="Times New Roman" w:eastAsia="Times New Roman" w:hAnsi="Times New Roman" w:cs="Times New Roman"/>
+          <w:kern w:val="0"/>
+          <w14:ligatures w14:val="none"/>
+        </w:rPr>
+        <w:t xml:space="preserve"> License Detention.</w:t>
+      </w:r>
+    </w:p>
+    <w:p>
+      <w:pPr>
+        <w:spacing w:after="0" w:line="240" w:lineRule="auto"/>
+        <w:ind w:firstLine="360"/>
+        <w:rPr>
+          <w:rFonts w:ascii="Times New Roman" w:eastAsia="Times New Roman" w:hAnsi="Times New Roman" w:cs="Times New Roman"/>
+          <w:kern w:val="0"/>
+          <w14:ligatures w14:val="none"/>
+        </w:rPr>
+      </w:pPr>
+      <w:proofErr w:type="gramStart"/>
+      <w:r>
+        <w:rPr>
+          <w:rFonts w:ascii="Times New Roman" w:eastAsia="Times New Roman" w:hAnsi="Symbol" w:cs="Times New Roman"/>
+          <w:kern w:val="0"/>
+          <w14:ligatures w14:val="none"/>
+        </w:rPr>
+        <w:t></w:t>
+      </w:r>
+      <w:r>
+        <w:rPr>
+          <w:rFonts w:ascii="Times New Roman" w:eastAsia="Times New Roman" w:hAnsi="Times New Roman" w:cs="Times New Roman"/>
+          <w:kern w:val="0"/>
+          <w14:ligatures w14:val="none"/>
+        </w:rPr>
+        <w:t xml:space="preserve">  Driving</w:t>
+      </w:r>
+      <w:proofErr w:type="gramEnd"/>
+      <w:r>
+        <w:rPr>
+          <w:rFonts w:ascii="Times New Roman" w:eastAsia="Times New Roman" w:hAnsi="Times New Roman" w:cs="Times New Roman"/>
+          <w:kern w:val="0"/>
+          <w14:ligatures w14:val="none"/>
+        </w:rPr>
+        <w:t xml:space="preserve"> License Release.</w:t>
+      </w:r>
+    </w:p>
+    <w:p>
+      <w:pPr>
+        <w:spacing w:after="0" w:line="240" w:lineRule="auto"/>
+        <w:ind w:firstLine="360"/>
+        <w:rPr>
+          <w:rFonts w:ascii="Times New Roman" w:eastAsia="Times New Roman" w:hAnsi="Times New Roman" w:cs="Times New Roman"/>
+          <w:kern w:val="0"/>
+          <w14:ligatures w14:val="none"/>
+        </w:rPr>
+      </w:pPr>
+      <w:proofErr w:type="gramStart"/>
+      <w:r>
+        <w:rPr>
+          <w:rFonts w:ascii="Times New Roman" w:eastAsia="Times New Roman" w:hAnsi="Symbol" w:cs="Times New Roman"/>
+          <w:kern w:val="0"/>
+          <w14:ligatures w14:val="none"/>
+        </w:rPr>
+        <w:t></w:t>
+      </w:r>
+      <w:r>
+        <w:rPr>
+          <w:rFonts w:ascii="Times New Roman" w:eastAsia="Times New Roman" w:hAnsi="Times New Roman" w:cs="Times New Roman"/>
+          <w:kern w:val="0"/>
+          <w14:ligatures w14:val="none"/>
+        </w:rPr>
+        <w:t xml:space="preserve">  International</w:t>
+      </w:r>
+      <w:proofErr w:type="gramEnd"/>
+      <w:r>
+        <w:rPr>
+          <w:rFonts w:ascii="Times New Roman" w:eastAsia="Times New Roman" w:hAnsi="Times New Roman" w:cs="Times New Roman"/>
+          <w:kern w:val="0"/>
+          <w14:ligatures w14:val="none"/>
+        </w:rPr>
+        <w:t xml:space="preserve"> Driving License Issuance.</w:t>
+      </w:r>
+    </w:p>
+    <w:p>
+      <w:pPr>
+        <w:spacing w:after="0" w:line="240" w:lineRule="auto"/>
+        <w:ind w:firstLine="360"/>
+        <w:rPr>
+          <w:rFonts w:ascii="Times New Roman" w:eastAsia="Times New Roman" w:hAnsi="Times New Roman" w:cs="Times New Roman"/>
+          <w:kern w:val="0"/>
+          <w14:ligatures w14:val="none"/>
+        </w:rPr>
+      </w:pPr>
+      <w:proofErr w:type="gramStart"/>
+      <w:r>
+        <w:rPr>
+          <w:rFonts w:ascii="Times New Roman" w:eastAsia="Times New Roman" w:hAnsi="Symbol" w:cs="Times New Roman"/>
+          <w:kern w:val="0"/>
+          <w14:ligatures w14:val="none"/>
+        </w:rPr>
+        <w:t></w:t>
+      </w:r>
+      <w:r>
+        <w:rPr>
+          <w:rFonts w:ascii="Times New Roman" w:eastAsia="Times New Roman" w:hAnsi="Times New Roman" w:cs="Times New Roman"/>
+          <w:kern w:val="0"/>
+          <w14:ligatures w14:val="none"/>
+        </w:rPr>
+        <w:t xml:space="preserve">  Person</w:t>
+      </w:r>
+      <w:proofErr w:type="gramEnd"/>
+      <w:r>
+        <w:rPr>
+          <w:rFonts w:ascii="Times New Roman" w:eastAsia="Times New Roman" w:hAnsi="Times New Roman" w:cs="Times New Roman"/>
+          <w:kern w:val="0"/>
+          <w14:ligatures w14:val="none"/>
+        </w:rPr>
+        <w:t xml:space="preserve"> Management.</w:t>
+      </w:r>
+    </w:p>
+    <w:p>
+      <w:pPr>
+        <w:spacing w:after="0" w:line="240" w:lineRule="auto"/>
+        <w:ind w:firstLine="360"/>
+        <w:rPr>
+          <w:rFonts w:ascii="Times New Roman" w:eastAsia="Times New Roman" w:hAnsi="Times New Roman" w:cs="Times New Roman"/>
+          <w:kern w:val="0"/>
+          <w14:ligatures w14:val="none"/>
+        </w:rPr>
+      </w:pPr>
+      <w:proofErr w:type="gramStart"/>
+      <w:r>
+        <w:rPr>
+          <w:rFonts w:ascii="Times New Roman" w:eastAsia="Times New Roman" w:hAnsi="Symbol" w:cs="Times New Roman"/>
+          <w:kern w:val="0"/>
+          <w14:ligatures w14:val="none"/>
+        </w:rPr>
+        <w:t></w:t>
+      </w:r>
+      <w:r>
+        <w:rPr>
+          <w:rFonts w:ascii="Times New Roman" w:eastAsia="Times New Roman" w:hAnsi="Times New Roman" w:cs="Times New Roman"/>
+          <w:kern w:val="0"/>
+          <w14:ligatures w14:val="none"/>
+        </w:rPr>
+        <w:t xml:space="preserve">  Driver</w:t>
+      </w:r>
+      <w:proofErr w:type="gramEnd"/>
+      <w:r>
+        <w:rPr>
+          <w:rFonts w:ascii="Times New Roman" w:eastAsia="Times New Roman" w:hAnsi="Times New Roman" w:cs="Times New Roman"/>
+          <w:kern w:val="0"/>
+          <w14:ligatures w14:val="none"/>
+        </w:rPr>
+        <w:t xml:space="preserve"> Management.</w:t>
+      </w:r>
+    </w:p>
+    <w:p>
+      <w:pPr>
+        <w:spacing w:after="0" w:line="240" w:lineRule="auto"/>
+        <w:ind w:firstLine="360"/>
+        <w:rPr>
+          <w:rFonts w:ascii="Times New Roman" w:eastAsia="Times New Roman" w:hAnsi="Times New Roman" w:cs="Times New Roman"/>
+          <w:kern w:val="0"/>
+          <w14:ligatures w14:val="none"/>
+        </w:rPr>
+      </w:pPr>
+      <w:proofErr w:type="gramStart"/>
+      <w:r>
+        <w:rPr>
+          <w:rFonts w:ascii="Times New Roman" w:eastAsia="Times New Roman" w:hAnsi="Symbol" w:cs="Times New Roman"/>
+          <w:kern w:val="0"/>
+          <w14:ligatures w14:val="none"/>
+        </w:rPr>
+        <w:t></w:t>
+      </w:r>
+      <w:r>
+        <w:rPr>
+          <w:rFonts w:ascii="Times New Roman" w:eastAsia="Times New Roman" w:hAnsi="Times New Roman" w:cs="Times New Roman"/>
+          <w:kern w:val="0"/>
+          <w14:ligatures w14:val="none"/>
+        </w:rPr>
+        <w:t xml:space="preserve">  Application</w:t>
+      </w:r>
+      <w:proofErr w:type="gramEnd"/>
+      <w:r>
+        <w:rPr>
+          <w:rFonts w:ascii="Times New Roman" w:eastAsia="Times New Roman" w:hAnsi="Times New Roman" w:cs="Times New Roman"/>
+          <w:kern w:val="0"/>
+          <w14:ligatures w14:val="none"/>
+        </w:rPr>
+        <w:t xml:space="preserve"> Management.</w:t>
+      </w:r>
+    </w:p>
+    <w:p>
+      <w:pPr>
+        <w:spacing w:after="0" w:line="240" w:lineRule="auto"/>
+        <w:ind w:firstLine="360"/>
+        <w:rPr>
+          <w:rFonts w:ascii="Times New Roman" w:eastAsia="Times New Roman" w:hAnsi="Times New Roman" w:cs="Times New Roman"/>
+          <w:kern w:val="0"/>
+          <w14:ligatures w14:val="none"/>
+        </w:rPr>
+      </w:pPr>
+      <w:proofErr w:type="gramStart"/>
+      <w:r>
+        <w:rPr>
+          <w:rFonts w:ascii="Times New Roman" w:eastAsia="Times New Roman" w:hAnsi="Symbol" w:cs="Times New Roman"/>
+          <w:kern w:val="0"/>
+          <w14:ligatures w14:val="none"/>
+        </w:rPr>
+        <w:t></w:t>
+      </w:r>
+      <w:r>
+        <w:rPr>
+          <w:rFonts w:ascii="Times New Roman" w:eastAsia="Times New Roman" w:hAnsi="Times New Roman" w:cs="Times New Roman"/>
+          <w:kern w:val="0"/>
+          <w14:ligatures w14:val="none"/>
+        </w:rPr>
+        <w:t xml:space="preserve">  User</w:t>
+      </w:r>
+      <w:proofErr w:type="gramEnd"/>
+      <w:r>
+        <w:rPr>
+          <w:rFonts w:ascii="Times New Roman" w:eastAsia="Times New Roman" w:hAnsi="Times New Roman" w:cs="Times New Roman"/>
+          <w:kern w:val="0"/>
+          <w14:ligatures w14:val="none"/>
+        </w:rPr>
+        <w:t xml:space="preserve"> Management and Permissions.</w:t>
+      </w:r>
+    </w:p>
+    <w:p>
+      <w:pPr>
+        <w:spacing w:after="0" w:line="240" w:lineRule="auto"/>
+        <w:ind w:firstLine="360"/>
+        <w:rPr>
+          <w:rFonts w:ascii="Times New Roman" w:eastAsia="Times New Roman" w:hAnsi="Times New Roman" w:cs="Times New Roman"/>
+          <w:kern w:val="0"/>
+          <w14:ligatures w14:val="none"/>
+        </w:rPr>
+      </w:pPr>
+      <w:proofErr w:type="gramStart"/>
+      <w:r>
+        <w:rPr>
+          <w:rFonts w:ascii="Times New Roman" w:eastAsia="Times New Roman" w:hAnsi="Symbol" w:cs="Times New Roman"/>
+          <w:kern w:val="0"/>
+          <w14:ligatures w14:val="none"/>
+        </w:rPr>
+        <w:t></w:t>
+      </w:r>
+      <w:r>
+        <w:rPr>
+          <w:rFonts w:ascii="Times New Roman" w:eastAsia="Times New Roman" w:hAnsi="Times New Roman" w:cs="Times New Roman"/>
+          <w:kern w:val="0"/>
+          <w14:ligatures w14:val="none"/>
+        </w:rPr>
+        <w:t xml:space="preserve">  Vision</w:t>
+      </w:r>
+      <w:proofErr w:type="gramEnd"/>
+      <w:r>
+        <w:rPr>
+          <w:rFonts w:ascii="Times New Roman" w:eastAsia="Times New Roman" w:hAnsi="Times New Roman" w:cs="Times New Roman"/>
+          <w:kern w:val="0"/>
+          <w14:ligatures w14:val="none"/>
+        </w:rPr>
+        <w:t xml:space="preserve"> Test Management.</w:t>
+      </w:r>
+    </w:p>
+    <w:p>
+      <w:pPr>
+        <w:spacing w:after="0" w:line="240" w:lineRule="auto"/>
+        <w:ind w:firstLine="360"/>
+        <w:rPr>
+          <w:rFonts w:ascii="Times New Roman" w:eastAsia="Times New Roman" w:hAnsi="Times New Roman" w:cs="Times New Roman"/>
+          <w:kern w:val="0"/>
+          <w14:ligatures w14:val="none"/>
+        </w:rPr>
+      </w:pPr>
+      <w:proofErr w:type="gramStart"/>
+      <w:r>
+        <w:rPr>
+          <w:rFonts w:ascii="Times New Roman" w:eastAsia="Times New Roman" w:hAnsi="Symbol" w:cs="Times New Roman"/>
+          <w:kern w:val="0"/>
+          <w14:ligatures w14:val="none"/>
+        </w:rPr>
+        <w:t></w:t>
+      </w:r>
+      <w:r>
+        <w:rPr>
+          <w:rFonts w:ascii="Times New Roman" w:eastAsia="Times New Roman" w:hAnsi="Times New Roman" w:cs="Times New Roman"/>
+          <w:kern w:val="0"/>
+          <w14:ligatures w14:val="none"/>
+        </w:rPr>
+        <w:t xml:space="preserve">  Written</w:t>
+      </w:r>
+      <w:proofErr w:type="gramEnd"/>
+      <w:r>
+        <w:rPr>
+          <w:rFonts w:ascii="Times New Roman" w:eastAsia="Times New Roman" w:hAnsi="Times New Roman" w:cs="Times New Roman"/>
+          <w:kern w:val="0"/>
+          <w14:ligatures w14:val="none"/>
+        </w:rPr>
+        <w:t xml:space="preserve"> Test Management.</w:t>
+      </w:r>
+    </w:p>
+    <w:p>
+      <w:pPr>
+        <w:spacing w:after="0" w:line="240" w:lineRule="auto"/>
+        <w:ind w:firstLine="360"/>
+        <w:rPr>
+          <w:rFonts w:ascii="Times New Roman" w:eastAsia="Times New Roman" w:hAnsi="Times New Roman" w:cs="Times New Roman"/>
+          <w:kern w:val="0"/>
+          <w14:ligatures w14:val="none"/>
+        </w:rPr>
+      </w:pPr>
+      <w:proofErr w:type="gramStart"/>
+      <w:r>
+        <w:rPr>
+          <w:rFonts w:ascii="Times New Roman" w:eastAsia="Times New Roman" w:hAnsi="Symbol" w:cs="Times New Roman"/>
+          <w:kern w:val="0"/>
+          <w14:ligatures w14:val="none"/>
+        </w:rPr>
+        <w:t></w:t>
+      </w:r>
+      <w:r>
+        <w:rPr>
+          <w:rFonts w:ascii="Times New Roman" w:eastAsia="Times New Roman" w:hAnsi="Times New Roman" w:cs="Times New Roman"/>
+          <w:kern w:val="0"/>
+          <w14:ligatures w14:val="none"/>
+        </w:rPr>
+        <w:t xml:space="preserve">  Practical</w:t>
+      </w:r>
+      <w:proofErr w:type="gramEnd"/>
+      <w:r>
+        <w:rPr>
+          <w:rFonts w:ascii="Times New Roman" w:eastAsia="Times New Roman" w:hAnsi="Times New Roman" w:cs="Times New Roman"/>
+          <w:kern w:val="0"/>
+          <w14:ligatures w14:val="none"/>
+        </w:rPr>
+        <w:t xml:space="preserve"> Test Management.</w:t>
+      </w:r>
+    </w:p>
+    <w:p>
+      <w:pPr>
+        <w:spacing w:after="0" w:line="240" w:lineRule="auto"/>
+        <w:ind w:firstLine="360"/>
+        <w:rPr>
+          <w:rFonts w:ascii="Times New Roman" w:eastAsia="Times New Roman" w:hAnsi="Times New Roman" w:cs="Times New Roman"/>
+          <w:kern w:val="0"/>
+          <w14:ligatures w14:val="none"/>
+        </w:rPr>
+      </w:pPr>
+      <w:proofErr w:type="gramStart"/>
+      <w:r>
+        <w:rPr>
+          <w:rFonts w:ascii="Times New Roman" w:eastAsia="Times New Roman" w:hAnsi="Symbol" w:cs="Times New Roman"/>
+          <w:kern w:val="0"/>
+          <w14:ligatures w14:val="none"/>
+        </w:rPr>
+        <w:t></w:t>
+      </w:r>
+      <w:r>
+        <w:rPr>
+          <w:rFonts w:ascii="Times New Roman" w:eastAsia="Times New Roman" w:hAnsi="Times New Roman" w:cs="Times New Roman"/>
+          <w:kern w:val="0"/>
+          <w14:ligatures w14:val="none"/>
+        </w:rPr>
+        <w:t xml:space="preserve">  License</w:t>
+      </w:r>
+      <w:proofErr w:type="gramEnd"/>
+      <w:r>
+        <w:rPr>
+          <w:rFonts w:ascii="Times New Roman" w:eastAsia="Times New Roman" w:hAnsi="Times New Roman" w:cs="Times New Roman"/>
+          <w:kern w:val="0"/>
+          <w14:ligatures w14:val="none"/>
+        </w:rPr>
+        <w:t xml:space="preserve"> Class Management.</w:t>
+      </w:r>
+    </w:p>
+    <w:p>
+      <w:pPr>
+        <w:spacing w:after="0" w:line="240" w:lineRule="auto"/>
+        <w:ind w:firstLine="360"/>
+        <w:rPr>
+          <w:rFonts w:ascii="Times New Roman" w:eastAsia="Times New Roman" w:hAnsi="Times New Roman" w:cs="Times New Roman"/>
+          <w:kern w:val="0"/>
+          <w14:ligatures w14:val="none"/>
+        </w:rPr>
+      </w:pPr>
+      <w:proofErr w:type="gramStart"/>
+      <w:r>
+        <w:rPr>
+          <w:rFonts w:ascii="Times New Roman" w:eastAsia="Times New Roman" w:hAnsi="Symbol" w:cs="Times New Roman"/>
+          <w:kern w:val="0"/>
+          <w14:ligatures w14:val="none"/>
+        </w:rPr>
+        <w:t></w:t>
+      </w:r>
+      <w:r>
+        <w:rPr>
+          <w:rFonts w:ascii="Times New Roman" w:eastAsia="Times New Roman" w:hAnsi="Times New Roman" w:cs="Times New Roman"/>
+          <w:kern w:val="0"/>
+          <w14:ligatures w14:val="none"/>
+        </w:rPr>
+        <w:t xml:space="preserve">  Test</w:t>
+      </w:r>
+      <w:proofErr w:type="gramEnd"/>
+      <w:r>
+        <w:rPr>
+          <w:rFonts w:ascii="Times New Roman" w:eastAsia="Times New Roman" w:hAnsi="Times New Roman" w:cs="Times New Roman"/>
+          <w:kern w:val="0"/>
+          <w14:ligatures w14:val="none"/>
+        </w:rPr>
+        <w:t xml:space="preserve"> Type Management.</w:t>
+      </w:r>
+    </w:p>
+    <w:p>
+      <w:pPr>
+        <w:spacing w:after="0" w:line="240" w:lineRule="auto"/>
+        <w:ind w:firstLine="360"/>
+        <w:rPr>
+          <w:rFonts w:ascii="Times New Roman" w:eastAsia="Times New Roman" w:hAnsi="Times New Roman" w:cs="Times New Roman"/>
+          <w:kern w:val="0"/>
+          <w14:ligatures w14:val="none"/>
+        </w:rPr>
+      </w:pPr>
+      <w:proofErr w:type="gramStart"/>
+      <w:r>
+        <w:rPr>
+          <w:rFonts w:ascii="Times New Roman" w:eastAsia="Times New Roman" w:hAnsi="Symbol" w:cs="Times New Roman"/>
+          <w:kern w:val="0"/>
+          <w14:ligatures w14:val="none"/>
+        </w:rPr>
+        <w:t></w:t>
+      </w:r>
+      <w:r>
+        <w:rPr>
+          <w:rFonts w:ascii="Times New Roman" w:eastAsia="Times New Roman" w:hAnsi="Times New Roman" w:cs="Times New Roman"/>
+          <w:kern w:val="0"/>
+          <w14:ligatures w14:val="none"/>
+        </w:rPr>
+        <w:t xml:space="preserve">  License</w:t>
+      </w:r>
+      <w:proofErr w:type="gramEnd"/>
+      <w:r>
+        <w:rPr>
+          <w:rFonts w:ascii="Times New Roman" w:eastAsia="Times New Roman" w:hAnsi="Times New Roman" w:cs="Times New Roman"/>
+          <w:kern w:val="0"/>
+          <w14:ligatures w14:val="none"/>
+        </w:rPr>
+        <w:t xml:space="preserve"> Inquiry and Search.</w:t>
+      </w:r>
+    </w:p>
+    <w:p>
+      <w:pPr>
+        <w:spacing w:after="0"/>
+        <w:ind w:firstLine="360"/>
+        <w:rPr>
+          <w:rFonts w:ascii="Times New Roman" w:eastAsia="Times New Roman" w:hAnsi="Times New Roman" w:cs="Times New Roman"/>
+          <w:kern w:val="0"/>
+          <w14:ligatures w14:val="none"/>
+        </w:rPr>
+      </w:pPr>
+      <w:proofErr w:type="gramStart"/>
+      <w:r>
+        <w:rPr>
+          <w:rFonts w:ascii="Times New Roman" w:eastAsia="Times New Roman" w:hAnsi="Symbol" w:cs="Times New Roman"/>
+          <w:kern w:val="0"/>
+          <w14:ligatures w14:val="none"/>
+        </w:rPr>
+        <w:t></w:t>
+      </w:r>
+      <w:r>
+        <w:rPr>
+          <w:rFonts w:ascii="Times New Roman" w:eastAsia="Times New Roman" w:hAnsi="Times New Roman" w:cs="Times New Roman"/>
+          <w:kern w:val="0"/>
+          <w14:ligatures w14:val="none"/>
+        </w:rPr>
+        <w:t xml:space="preserve">  </w:t>
+      </w:r>
+      <w:r>
+        <w:rPr>
+          <w:rFonts w:ascii="Times New Roman" w:eastAsia="Times New Roman" w:hAnsi="Times New Roman" w:cs="Times New Roman"/>
+          <w:kern w:val="0"/>
+          <w14:ligatures w14:val="none"/>
+        </w:rPr>
+        <w:t>Audit</w:t>
+      </w:r>
+      <w:proofErr w:type="gramEnd"/>
+      <w:r>
+        <w:rPr>
+          <w:rFonts w:ascii="Times New Roman" w:eastAsia="Times New Roman" w:hAnsi="Times New Roman" w:cs="Times New Roman"/>
+          <w:kern w:val="0"/>
+          <w14:ligatures w14:val="none"/>
+        </w:rPr>
+        <w:t xml:space="preserve"> Tracking and Activity Logging.</w:t>
+      </w:r>
+    </w:p>
+    <w:p>
+      <w:pPr>
+        <w:ind w:firstLine="360"/>
+        <w:rPr>
+          <w:sz w:val="22"/>
+          <w:szCs w:val="22"/>
+        </w:rPr>
+      </w:pPr>
+      <w:proofErr w:type="gramStart"/>
+      <w:r>
+        <w:rPr>
+          <w:rFonts w:ascii="Times New Roman" w:eastAsia="Times New Roman" w:hAnsi="Symbol" w:cs="Times New Roman"/>
+          <w:kern w:val="0"/>
+          <w14:ligatures w14:val="none"/>
+        </w:rPr>
+        <w:t></w:t>
+      </w:r>
+      <w:r>
+        <w:rPr>
+          <w:rFonts w:ascii="Times New Roman" w:eastAsia="Times New Roman" w:hAnsi="Symbol" w:cs="Times New Roman"/>
+          <w:kern w:val="0"/>
+          <w14:ligatures w14:val="none"/>
+        </w:rPr>
+        <w:t xml:space="preserve">  </w:t>
+      </w:r>
+      <w:r>
+        <w:rPr>
+          <w:sz w:val="22"/>
+          <w:szCs w:val="22"/>
+        </w:rPr>
+        <w:t>Generating</w:t>
+      </w:r>
+      <w:proofErr w:type="gramEnd"/>
+      <w:r>
+        <w:rPr>
+          <w:sz w:val="22"/>
+          <w:szCs w:val="22"/>
+        </w:rPr>
+        <w:t xml:space="preserve"> records and reports to licenses and applications</w:t>
+      </w:r>
+    </w:p>
+    <w:p>
+      <w:pPr>
+        <w:rPr>
+          <w:sz w:val="22"/>
+          <w:szCs w:val="22"/>
+        </w:rPr>
+      </w:pPr>
+    </w:p>
+    <w:p>
+      <w:pPr>
+        <w:ind w:left="360"/>
+        <w:rPr>
+          <w:b/>
+          <w:bCs/>
+          <w:sz w:val="22"/>
+          <w:szCs w:val="22"/>
+        </w:rPr>
+      </w:pPr>
+      <w:r>
+        <w:rPr>
+          <w:b/>
+          <w:bCs/>
+          <w:sz w:val="22"/>
+          <w:szCs w:val="22"/>
+        </w:rPr>
+        <w:t>2.3 User Needs</w:t>
+      </w:r>
+    </w:p>
+    <w:p>
+      <w:pPr>
+        <w:ind w:left="360"/>
+        <w:rPr>
+          <w:sz w:val="22"/>
+          <w:szCs w:val="22"/>
+        </w:rPr>
+      </w:pPr>
+      <w:r>
+        <w:rPr>
+          <w:sz w:val="22"/>
+          <w:szCs w:val="22"/>
+        </w:rPr>
+        <w:t>The primary users of the DVLD System are licensing department employees, administrators, and authorized staff members responsible for processing driver licensing services.</w:t>
+      </w:r>
+    </w:p>
+    <w:p>
+      <w:pPr>
+        <w:ind w:left="360"/>
+        <w:rPr>
+          <w:sz w:val="22"/>
+          <w:szCs w:val="22"/>
+        </w:rPr>
+      </w:pPr>
+      <w:r>
+        <w:rPr>
+          <w:sz w:val="22"/>
+          <w:szCs w:val="22"/>
+        </w:rPr>
+        <w:t>Users need a centralized system that enables them to manage applicants, process license applications, schedule and record driving tests, issue and renew licenses, handle license replacements, manage detained licenses, and maintain accurate driver records.</w:t>
+      </w:r>
+    </w:p>
+    <w:p>
+      <w:pPr>
+        <w:ind w:left="360"/>
+        <w:rPr>
+          <w:sz w:val="22"/>
+          <w:szCs w:val="22"/>
+        </w:rPr>
+      </w:pPr>
+      <w:r>
+        <w:rPr>
+          <w:sz w:val="22"/>
+          <w:szCs w:val="22"/>
+        </w:rPr>
+        <w:lastRenderedPageBreak/>
+        <w:t>The system should provide efficient access to applicant and license information, reduce manual paperwork, improve data accuracy, and support daily licensing operations through a secure and user-friendly interface.</w:t>
+      </w:r>
+    </w:p>
+    <w:p>
+      <w:pPr>
+        <w:ind w:left="360"/>
+        <w:rPr>
+          <w:sz w:val="22"/>
+          <w:szCs w:val="22"/>
+        </w:rPr>
+      </w:pPr>
+    </w:p>
     <w:sectPr>
       <w:pgSz w:w="11906" w:h="16838" w:code="9"/>
       <w:pgMar w:top="1440" w:right="1440" w:bottom="1440" w:left="1440" w:header="720" w:footer="720" w:gutter="0"/>
@@ -2081,6 +3319,243 @@
     </w:sectPr>
   </w:body>
 </w:document>
+</file>
+
+<file path=word/numbering.xml><?xml version="1.0" encoding="utf-8"?>
+<w:numbering xmlns:wpc="http://schemas.microsoft.com/office/word/2010/wordprocessingCanvas" xmlns:cx="http://schemas.microsoft.com/office/drawing/2014/chartex" xmlns:cx1="http://schemas.microsoft.com/office/drawing/2015/9/8/chartex" xmlns:cx2="http://schemas.microsoft.com/office/drawing/2015/10/21/chartex" xmlns:cx3="http://schemas.microsoft.com/office/drawing/2016/5/9/chartex" xmlns:cx4="http://schemas.microsoft.com/office/drawing/2016/5/10/chartex" xmlns:cx5="http://schemas.microsoft.com/office/drawing/2016/5/11/chartex" xmlns:cx6="http://schemas.microsoft.com/office/drawing/2016/5/12/chartex" xmlns:cx7="http://schemas.microsoft.com/office/drawing/2016/5/13/chartex" xmlns:cx8="http://schemas.microsoft.com/office/drawing/2016/5/14/chartex" xmlns:mc="http://schemas.openxmlformats.org/markup-compatibility/2006" xmlns:aink="http://schemas.microsoft.com/office/drawing/2016/ink" xmlns:am3d="http://schemas.microsoft.com/office/drawing/2017/model3d" xmlns:o="urn:schemas-microsoft-com:office:office" xmlns:oel="http://schemas.microsoft.com/office/2019/extlst" xmlns:r="http://schemas.openxmlformats.org/officeDocument/2006/relationships" xmlns:m="http://schemas.openxmlformats.org/officeDocument/2006/math" xmlns:v="urn:schemas-microsoft-com:vml" xmlns:wp14="http://schemas.microsoft.com/office/word/2010/wordprocessingDrawing" xmlns:wp="http://schemas.openxmlformats.org/drawingml/2006/wordprocessingDrawing" xmlns:w10="urn:schemas-microsoft-com:office:word" xmlns:w="http://schemas.openxmlformats.org/wordprocessingml/2006/main" xmlns:w14="http://schemas.microsoft.com/office/word/2010/wordml" xmlns:w15="http://schemas.microsoft.com/office/word/2012/wordml" xmlns:w16cex="http://schemas.microsoft.com/office/word/2018/wordml/cex" xmlns:w16cid="http://schemas.microsoft.com/office/word/2016/wordml/cid" xmlns:w16="http://schemas.microsoft.com/office/word/2018/wordml" xmlns:w16sdtdh="http://schemas.microsoft.com/office/word/2020/wordml/sdtdatahash" xmlns:w16se="http://schemas.microsoft.com/office/word/2015/wordml/symex" xmlns:wpg="http://schemas.microsoft.com/office/word/2010/wordprocessingGroup" xmlns:wpi="http://schemas.microsoft.com/office/word/2010/wordprocessingInk" xmlns:wne="http://schemas.microsoft.com/office/word/2006/wordml" xmlns:wps="http://schemas.microsoft.com/office/word/2010/wordprocessingShape" mc:Ignorable="w14 w15 w16se w16cid w16 w16cex w16sdtdh wp14">
+  <w:abstractNum w:abstractNumId="0" w15:restartNumberingAfterBreak="0">
+    <w:nsid w:val="293179B6"/>
+    <w:multiLevelType w:val="hybridMultilevel"/>
+    <w:tmpl w:val="23D0308C"/>
+    <w:lvl w:ilvl="0" w:tplc="FA6A5284">
+      <w:start w:val="2"/>
+      <w:numFmt w:val="bullet"/>
+      <w:lvlText w:val="-"/>
+      <w:lvlJc w:val="left"/>
+      <w:pPr>
+        <w:ind w:left="720" w:hanging="360"/>
+      </w:pPr>
+      <w:rPr>
+        <w:rFonts w:ascii="Aptos" w:eastAsiaTheme="minorHAnsi" w:hAnsi="Aptos" w:cstheme="minorBidi" w:hint="default"/>
+      </w:rPr>
+    </w:lvl>
+    <w:lvl w:ilvl="1" w:tplc="04090003" w:tentative="1">
+      <w:start w:val="1"/>
+      <w:numFmt w:val="bullet"/>
+      <w:lvlText w:val="o"/>
+      <w:lvlJc w:val="left"/>
+      <w:pPr>
+        <w:ind w:left="1440" w:hanging="360"/>
+      </w:pPr>
+      <w:rPr>
+        <w:rFonts w:ascii="Courier New" w:hAnsi="Courier New" w:cs="Courier New" w:hint="default"/>
+      </w:rPr>
+    </w:lvl>
+    <w:lvl w:ilvl="2" w:tplc="04090005" w:tentative="1">
+      <w:start w:val="1"/>
+      <w:numFmt w:val="bullet"/>
+      <w:lvlText w:val=""/>
+      <w:lvlJc w:val="left"/>
+      <w:pPr>
+        <w:ind w:left="2160" w:hanging="360"/>
+      </w:pPr>
+      <w:rPr>
+        <w:rFonts w:ascii="Wingdings" w:hAnsi="Wingdings" w:hint="default"/>
+      </w:rPr>
+    </w:lvl>
+    <w:lvl w:ilvl="3" w:tplc="04090001" w:tentative="1">
+      <w:start w:val="1"/>
+      <w:numFmt w:val="bullet"/>
+      <w:lvlText w:val=""/>
+      <w:lvlJc w:val="left"/>
+      <w:pPr>
+        <w:ind w:left="2880" w:hanging="360"/>
+      </w:pPr>
+      <w:rPr>
+        <w:rFonts w:ascii="Symbol" w:hAnsi="Symbol" w:hint="default"/>
+      </w:rPr>
+    </w:lvl>
+    <w:lvl w:ilvl="4" w:tplc="04090003" w:tentative="1">
+      <w:start w:val="1"/>
+      <w:numFmt w:val="bullet"/>
+      <w:lvlText w:val="o"/>
+      <w:lvlJc w:val="left"/>
+      <w:pPr>
+        <w:ind w:left="3600" w:hanging="360"/>
+      </w:pPr>
+      <w:rPr>
+        <w:rFonts w:ascii="Courier New" w:hAnsi="Courier New" w:cs="Courier New" w:hint="default"/>
+      </w:rPr>
+    </w:lvl>
+    <w:lvl w:ilvl="5" w:tplc="04090005" w:tentative="1">
+      <w:start w:val="1"/>
+      <w:numFmt w:val="bullet"/>
+      <w:lvlText w:val=""/>
+      <w:lvlJc w:val="left"/>
+      <w:pPr>
+        <w:ind w:left="4320" w:hanging="360"/>
+      </w:pPr>
+      <w:rPr>
+        <w:rFonts w:ascii="Wingdings" w:hAnsi="Wingdings" w:hint="default"/>
+      </w:rPr>
+    </w:lvl>
+    <w:lvl w:ilvl="6" w:tplc="04090001" w:tentative="1">
+      <w:start w:val="1"/>
+      <w:numFmt w:val="bullet"/>
+      <w:lvlText w:val=""/>
+      <w:lvlJc w:val="left"/>
+      <w:pPr>
+        <w:ind w:left="5040" w:hanging="360"/>
+      </w:pPr>
+      <w:rPr>
+        <w:rFonts w:ascii="Symbol" w:hAnsi="Symbol" w:hint="default"/>
+      </w:rPr>
+    </w:lvl>
+    <w:lvl w:ilvl="7" w:tplc="04090003" w:tentative="1">
+      <w:start w:val="1"/>
+      <w:numFmt w:val="bullet"/>
+      <w:lvlText w:val="o"/>
+      <w:lvlJc w:val="left"/>
+      <w:pPr>
+        <w:ind w:left="5760" w:hanging="360"/>
+      </w:pPr>
+      <w:rPr>
+        <w:rFonts w:ascii="Courier New" w:hAnsi="Courier New" w:cs="Courier New" w:hint="default"/>
+      </w:rPr>
+    </w:lvl>
+    <w:lvl w:ilvl="8" w:tplc="04090005" w:tentative="1">
+      <w:start w:val="1"/>
+      <w:numFmt w:val="bullet"/>
+      <w:lvlText w:val=""/>
+      <w:lvlJc w:val="left"/>
+      <w:pPr>
+        <w:ind w:left="6480" w:hanging="360"/>
+      </w:pPr>
+      <w:rPr>
+        <w:rFonts w:ascii="Wingdings" w:hAnsi="Wingdings" w:hint="default"/>
+      </w:rPr>
+    </w:lvl>
+  </w:abstractNum>
+  <w:abstractNum w:abstractNumId="1" w15:restartNumberingAfterBreak="0">
+    <w:nsid w:val="72671BF2"/>
+    <w:multiLevelType w:val="multilevel"/>
+    <w:tmpl w:val="6DD60B2A"/>
+    <w:lvl w:ilvl="0">
+      <w:start w:val="1"/>
+      <w:numFmt w:val="decimal"/>
+      <w:lvlText w:val="%1"/>
+      <w:lvlJc w:val="left"/>
+      <w:pPr>
+        <w:ind w:left="390" w:hanging="390"/>
+      </w:pPr>
+      <w:rPr>
+        <w:rFonts w:hint="default"/>
+      </w:rPr>
+    </w:lvl>
+    <w:lvl w:ilvl="1">
+      <w:start w:val="1"/>
+      <w:numFmt w:val="decimal"/>
+      <w:lvlText w:val="%1.%2"/>
+      <w:lvlJc w:val="left"/>
+      <w:pPr>
+        <w:ind w:left="390" w:hanging="390"/>
+      </w:pPr>
+      <w:rPr>
+        <w:rFonts w:hint="default"/>
+      </w:rPr>
+    </w:lvl>
+    <w:lvl w:ilvl="2">
+      <w:start w:val="1"/>
+      <w:numFmt w:val="decimal"/>
+      <w:lvlText w:val="%1.%2.%3"/>
+      <w:lvlJc w:val="left"/>
+      <w:pPr>
+        <w:ind w:left="720" w:hanging="720"/>
+      </w:pPr>
+      <w:rPr>
+        <w:rFonts w:hint="default"/>
+      </w:rPr>
+    </w:lvl>
+    <w:lvl w:ilvl="3">
+      <w:start w:val="1"/>
+      <w:numFmt w:val="decimal"/>
+      <w:lvlText w:val="%1.%2.%3.%4"/>
+      <w:lvlJc w:val="left"/>
+      <w:pPr>
+        <w:ind w:left="1080" w:hanging="1080"/>
+      </w:pPr>
+      <w:rPr>
+        <w:rFonts w:hint="default"/>
+      </w:rPr>
+    </w:lvl>
+    <w:lvl w:ilvl="4">
+      <w:start w:val="1"/>
+      <w:numFmt w:val="decimal"/>
+      <w:lvlText w:val="%1.%2.%3.%4.%5"/>
+      <w:lvlJc w:val="left"/>
+      <w:pPr>
+        <w:ind w:left="1080" w:hanging="1080"/>
+      </w:pPr>
+      <w:rPr>
+        <w:rFonts w:hint="default"/>
+      </w:rPr>
+    </w:lvl>
+    <w:lvl w:ilvl="5">
+      <w:start w:val="1"/>
+      <w:numFmt w:val="decimal"/>
+      <w:lvlText w:val="%1.%2.%3.%4.%5.%6"/>
+      <w:lvlJc w:val="left"/>
+      <w:pPr>
+        <w:ind w:left="1440" w:hanging="1440"/>
+      </w:pPr>
+      <w:rPr>
+        <w:rFonts w:hint="default"/>
+      </w:rPr>
+    </w:lvl>
+    <w:lvl w:ilvl="6">
+      <w:start w:val="1"/>
+      <w:numFmt w:val="decimal"/>
+      <w:lvlText w:val="%1.%2.%3.%4.%5.%6.%7"/>
+      <w:lvlJc w:val="left"/>
+      <w:pPr>
+        <w:ind w:left="1440" w:hanging="1440"/>
+      </w:pPr>
+      <w:rPr>
+        <w:rFonts w:hint="default"/>
+      </w:rPr>
+    </w:lvl>
+    <w:lvl w:ilvl="7">
+      <w:start w:val="1"/>
+      <w:numFmt w:val="decimal"/>
+      <w:lvlText w:val="%1.%2.%3.%4.%5.%6.%7.%8"/>
+      <w:lvlJc w:val="left"/>
+      <w:pPr>
+        <w:ind w:left="1800" w:hanging="1800"/>
+      </w:pPr>
+      <w:rPr>
+        <w:rFonts w:hint="default"/>
+      </w:rPr>
+    </w:lvl>
+    <w:lvl w:ilvl="8">
+      <w:start w:val="1"/>
+      <w:numFmt w:val="decimal"/>
+      <w:lvlText w:val="%1.%2.%3.%4.%5.%6.%7.%8.%9"/>
+      <w:lvlJc w:val="left"/>
+      <w:pPr>
+        <w:ind w:left="1800" w:hanging="1800"/>
+      </w:pPr>
+      <w:rPr>
+        <w:rFonts w:hint="default"/>
+      </w:rPr>
+    </w:lvl>
+  </w:abstractNum>
+  <w:num w:numId="1" w16cid:durableId="1353149544">
+    <w:abstractNumId w:val="1"/>
+  </w:num>
+  <w:num w:numId="2" w16cid:durableId="542060079">
+    <w:abstractNumId w:val="0"/>
+  </w:num>
+</w:numbering>
 </file>
 
 <file path=word/styles.xml><?xml version="1.0" encoding="utf-8"?>

</xml_diff>